<commit_message>
Valokaari: korjaa päivänpituusesimerkit (Rovaniemi 24 h, tasauspäivät, Helsinki 15.1.)
Co-Authored-By: Claude Opus 5.5 <noreply@anthropic.com>
</commit_message>
<xml_diff>
--- a/valokaari/downloads/nayton-dokumentointipohjat.docx
+++ b/valokaari/downloads/nayton-dokumentointipohjat.docx
@@ -5249,10 +5249,6 @@
 </w:document>
 </file>
 
-<file path=word/comments.xml><?xml version="1.0" encoding="utf-8"?>
-<w:comments xmlns:cx="http://schemas.microsoft.com/office/drawing/2014/chartex" xmlns:cx1="http://schemas.microsoft.com/office/drawing/2015/9/8/chartex" xmlns:cx2="http://schemas.microsoft.com/office/drawing/2015/10/21/chartex" xmlns:cx3="http://schemas.microsoft.com/office/drawing/2016/5/9/chartex" xmlns:cx4="http://schemas.microsoft.com/office/drawing/2016/5/10/chartex" xmlns:cx5="http://schemas.microsoft.com/office/drawing/2016/5/11/chartex" xmlns:cx6="http://schemas.microsoft.com/office/drawing/2016/5/12/chartex" xmlns:cx7="http://schemas.microsoft.com/office/drawing/2016/5/13/chartex" xmlns:cx8="http://schemas.microsoft.com/office/drawing/2016/5/14/chartex" xmlns:mc="http://schemas.openxmlformats.org/markup-compatibility/2006" xmlns:aink="http://schemas.microsoft.com/office/drawing/2016/ink" xmlns:am3d="http://schemas.microsoft.com/office/drawing/2017/model3d" xmlns:o="urn:schemas-microsoft-com:office:office" xmlns:r="http://schemas.openxmlformats.org/officeDocument/2006/relationships" xmlns:m="http://schemas.openxmlformats.org/officeDocument/2006/math" xmlns:v="urn:schemas-microsoft-com:vml" xmlns:wp14="http://schemas.microsoft.com/office/word/2010/wordprocessingDrawing" xmlns:wp="http://schemas.openxmlformats.org/drawingml/2006/wordprocessingDrawing" xmlns:w10="urn:schemas-microsoft-com:office:word" xmlns:w="http://schemas.openxmlformats.org/wordprocessingml/2006/main" xmlns:w14="http://schemas.microsoft.com/office/word/2010/wordml" xmlns:w15="http://schemas.microsoft.com/office/word/2012/wordml" xmlns:w16cex="http://schemas.microsoft.com/office/word/2018/wordml/cex" xmlns:w16cid="http://schemas.microsoft.com/office/word/2016/wordml/cid" xmlns:w16="http://schemas.microsoft.com/office/word/2018/wordml" xmlns:w16sdtdh="http://schemas.microsoft.com/office/word/2020/wordml/sdtdatahash" xmlns:w16se="http://schemas.microsoft.com/office/word/2015/wordml/symex" xmlns:wpg="http://schemas.microsoft.com/office/word/2010/wordprocessingGroup" xmlns:wpi="http://schemas.microsoft.com/office/word/2010/wordprocessingInk" xmlns:wne="http://schemas.microsoft.com/office/word/2006/wordml" xmlns:wps="http://schemas.microsoft.com/office/word/2010/wordprocessingShape"/>
-</file>
-
 <file path=word/endnotes.xml><?xml version="1.0" encoding="utf-8"?>
 <w:endnotes xmlns:wpc="http://schemas.microsoft.com/office/word/2010/wordprocessingCanvas" xmlns:mc="http://schemas.openxmlformats.org/markup-compatibility/2006" xmlns:o="urn:schemas-microsoft-com:office:office" xmlns:r="http://schemas.openxmlformats.org/officeDocument/2006/relationships" xmlns:m="http://schemas.openxmlformats.org/officeDocument/2006/math" xmlns:v="urn:schemas-microsoft-com:vml" xmlns:wp14="http://schemas.microsoft.com/office/word/2010/wordprocessingDrawing" xmlns:wp="http://schemas.openxmlformats.org/drawingml/2006/wordprocessingDrawing" xmlns:w10="urn:schemas-microsoft-com:office:word" xmlns:w="http://schemas.openxmlformats.org/wordprocessingml/2006/main" xmlns:w14="http://schemas.microsoft.com/office/word/2010/wordml" xmlns:w15="http://schemas.microsoft.com/office/word/2012/wordml" xmlns:wpg="http://schemas.microsoft.com/office/word/2010/wordprocessingGroup" xmlns:wpi="http://schemas.microsoft.com/office/word/2010/wordprocessingInk" xmlns:wne="http://schemas.microsoft.com/office/word/2006/wordml" xmlns:wps="http://schemas.microsoft.com/office/word/2010/wordprocessingShape" mc:Ignorable="w14 w15 wp14">
   <w:endnote w:type="separator" w:id="-1">
@@ -5331,7 +5327,7 @@
 <w:numbering xmlns:wpc="http://schemas.microsoft.com/office/word/2010/wordprocessingCanvas" xmlns:mc="http://schemas.openxmlformats.org/markup-compatibility/2006" xmlns:o="urn:schemas-microsoft-com:office:office" xmlns:r="http://schemas.openxmlformats.org/officeDocument/2006/relationships" xmlns:m="http://schemas.openxmlformats.org/officeDocument/2006/math" xmlns:v="urn:schemas-microsoft-com:vml" xmlns:wp14="http://schemas.microsoft.com/office/word/2010/wordprocessingDrawing" xmlns:wp="http://schemas.openxmlformats.org/drawingml/2006/wordprocessingDrawing" xmlns:w10="urn:schemas-microsoft-com:office:word" xmlns:w="http://schemas.openxmlformats.org/wordprocessingml/2006/main" xmlns:w14="http://schemas.microsoft.com/office/word/2010/wordml" xmlns:w15="http://schemas.microsoft.com/office/word/2012/wordml" xmlns:wpg="http://schemas.microsoft.com/office/word/2010/wordprocessingGroup" xmlns:wpi="http://schemas.microsoft.com/office/word/2010/wordprocessingInk" xmlns:wne="http://schemas.microsoft.com/office/word/2006/wordml" xmlns:wps="http://schemas.microsoft.com/office/word/2010/wordprocessingShape" mc:Ignorable="w14 w15 wp14">
   <w:abstractNum w:abstractNumId="1" w15:restartNumberingAfterBreak="0">
     <w:multiLevelType w:val="hybridMultilevel"/>
-    <w:lvl w:ilvl="0" w15:tentative="1">
+    <w:lvl w:ilvl="0" w:tentative="1">
       <w:start w:val="1"/>
       <w:numFmt w:val="bullet"/>
       <w:lvlText w:val="●"/>
@@ -5340,7 +5336,7 @@
         <w:ind w:left="720" w:hanging="360"/>
       </w:pPr>
     </w:lvl>
-    <w:lvl w:ilvl="1" w15:tentative="1">
+    <w:lvl w:ilvl="1" w:tentative="1">
       <w:start w:val="1"/>
       <w:numFmt w:val="bullet"/>
       <w:lvlText w:val="○"/>
@@ -5349,7 +5345,7 @@
         <w:ind w:left="1440" w:hanging="360"/>
       </w:pPr>
     </w:lvl>
-    <w:lvl w:ilvl="2" w15:tentative="1">
+    <w:lvl w:ilvl="2" w:tentative="1">
       <w:start w:val="1"/>
       <w:numFmt w:val="bullet"/>
       <w:lvlText w:val="■"/>
@@ -5358,7 +5354,7 @@
         <w:ind w:left="2160" w:hanging="360"/>
       </w:pPr>
     </w:lvl>
-    <w:lvl w:ilvl="3" w15:tentative="1">
+    <w:lvl w:ilvl="3" w:tentative="1">
       <w:start w:val="1"/>
       <w:numFmt w:val="bullet"/>
       <w:lvlText w:val="●"/>
@@ -5367,7 +5363,7 @@
         <w:ind w:left="2880" w:hanging="360"/>
       </w:pPr>
     </w:lvl>
-    <w:lvl w:ilvl="4" w15:tentative="1">
+    <w:lvl w:ilvl="4" w:tentative="1">
       <w:start w:val="1"/>
       <w:numFmt w:val="bullet"/>
       <w:lvlText w:val="○"/>
@@ -5376,7 +5372,7 @@
         <w:ind w:left="3600" w:hanging="360"/>
       </w:pPr>
     </w:lvl>
-    <w:lvl w:ilvl="5" w15:tentative="1">
+    <w:lvl w:ilvl="5" w:tentative="1">
       <w:start w:val="1"/>
       <w:numFmt w:val="bullet"/>
       <w:lvlText w:val="■"/>
@@ -5385,7 +5381,7 @@
         <w:ind w:left="4320" w:hanging="360"/>
       </w:pPr>
     </w:lvl>
-    <w:lvl w:ilvl="6" w15:tentative="1">
+    <w:lvl w:ilvl="6" w:tentative="1">
       <w:start w:val="1"/>
       <w:numFmt w:val="bullet"/>
       <w:lvlText w:val="●"/>
@@ -5394,7 +5390,7 @@
         <w:ind w:left="5040" w:hanging="360"/>
       </w:pPr>
     </w:lvl>
-    <w:lvl w:ilvl="7" w15:tentative="1">
+    <w:lvl w:ilvl="7" w:tentative="1">
       <w:start w:val="1"/>
       <w:numFmt w:val="bullet"/>
       <w:lvlText w:val="●"/>
@@ -5403,7 +5399,7 @@
         <w:ind w:left="5760" w:hanging="360"/>
       </w:pPr>
     </w:lvl>
-    <w:lvl w:ilvl="8" w15:tentative="1">
+    <w:lvl w:ilvl="8" w:tentative="1">
       <w:start w:val="1"/>
       <w:numFmt w:val="bullet"/>
       <w:lvlText w:val="●"/>
@@ -5434,6 +5430,10 @@
     </w:rPrDefault>
     <w:pPrDefault/>
   </w:docDefaults>
+  <w:style w:type="paragraph" w:styleId="Normal" w:default="1">
+    <w:name w:val="Normal"/>
+    <w:qFormat/>
+  </w:style>
   <w:style w:type="paragraph" w:styleId="Title">
     <w:name w:val="Title"/>
     <w:basedOn w:val="Normal"/>
@@ -5606,4 +5606,294 @@
     </w:rPr>
   </w:style>
 </w:styles>
+</file>
+
+<file path=word/theme/theme1.xml><?xml version="1.0" encoding="utf-8"?>
+<a:theme xmlns:a="http://schemas.openxmlformats.org/drawingml/2006/main" name="Office Theme">
+  <a:themeElements>
+    <a:clrScheme name="Office">
+      <a:dk1>
+        <a:sysClr val="windowText" lastClr="000000"/>
+      </a:dk1>
+      <a:lt1>
+        <a:sysClr val="window" lastClr="FFFFFF"/>
+      </a:lt1>
+      <a:dk2>
+        <a:srgbClr val="44546A"/>
+      </a:dk2>
+      <a:lt2>
+        <a:srgbClr val="E7E6E6"/>
+      </a:lt2>
+      <a:accent1>
+        <a:srgbClr val="4472C4"/>
+      </a:accent1>
+      <a:accent2>
+        <a:srgbClr val="ED7D31"/>
+      </a:accent2>
+      <a:accent3>
+        <a:srgbClr val="A5A5A5"/>
+      </a:accent3>
+      <a:accent4>
+        <a:srgbClr val="FFC000"/>
+      </a:accent4>
+      <a:accent5>
+        <a:srgbClr val="5B9BD5"/>
+      </a:accent5>
+      <a:accent6>
+        <a:srgbClr val="70AD47"/>
+      </a:accent6>
+      <a:hlink>
+        <a:srgbClr val="0563C1"/>
+      </a:hlink>
+      <a:folHlink>
+        <a:srgbClr val="954F72"/>
+      </a:folHlink>
+    </a:clrScheme>
+    <a:fontScheme name="Office">
+      <a:majorFont>
+        <a:latin typeface="Calibri Light" panose="020F0302020204030204"/>
+        <a:ea typeface=""/>
+        <a:cs typeface=""/>
+        <a:font script="Jpan" typeface="游ゴシック Light"/>
+        <a:font script="Hang" typeface="맑은 고딕"/>
+        <a:font script="Hans" typeface="等线 Light"/>
+        <a:font script="Hant" typeface="新細明體"/>
+        <a:font script="Arab" typeface="Times New Roman"/>
+        <a:font script="Hebr" typeface="Times New Roman"/>
+        <a:font script="Thai" typeface="Angsana New"/>
+        <a:font script="Ethi" typeface="Nyala"/>
+        <a:font script="Beng" typeface="Vrinda"/>
+        <a:font script="Gujr" typeface="Shruti"/>
+        <a:font script="Khmr" typeface="MoolBoran"/>
+        <a:font script="Knda" typeface="Tunga"/>
+        <a:font script="Guru" typeface="Raavi"/>
+        <a:font script="Cans" typeface="Euphemia"/>
+        <a:font script="Cher" typeface="Plantagenet Cherokee"/>
+        <a:font script="Yiii" typeface="Microsoft Yi Baiti"/>
+        <a:font script="Tibt" typeface="Microsoft Himalaya"/>
+        <a:font script="Thaa" typeface="MV Boli"/>
+        <a:font script="Deva" typeface="Mangal"/>
+        <a:font script="Telu" typeface="Gautami"/>
+        <a:font script="Taml" typeface="Latha"/>
+        <a:font script="Syrc" typeface="Estrangelo Edessa"/>
+        <a:font script="Orya" typeface="Kalinga"/>
+        <a:font script="Mlym" typeface="Kartika"/>
+        <a:font script="Laoo" typeface="DokChampa"/>
+        <a:font script="Sinh" typeface="Iskoola Pota"/>
+        <a:font script="Mong" typeface="Mongolian Baiti"/>
+        <a:font script="Viet" typeface="Times New Roman"/>
+        <a:font script="Uigh" typeface="Microsoft Uighur"/>
+        <a:font script="Geor" typeface="Sylfaen"/>
+        <a:font script="Armn" typeface="Arial"/>
+        <a:font script="Bugi" typeface="Leelawadee UI"/>
+        <a:font script="Bopo" typeface="Microsoft JhengHei"/>
+        <a:font script="Java" typeface="Javanese Text"/>
+        <a:font script="Lisu" typeface="Segoe UI"/>
+        <a:font script="Mymr" typeface="Myanmar Text"/>
+        <a:font script="Nkoo" typeface="Ebrima"/>
+        <a:font script="Olck" typeface="Nirmala UI"/>
+        <a:font script="Osma" typeface="Ebrima"/>
+        <a:font script="Phag" typeface="Phagspa"/>
+        <a:font script="Syrn" typeface="Estrangelo Edessa"/>
+        <a:font script="Syrj" typeface="Estrangelo Edessa"/>
+        <a:font script="Syre" typeface="Estrangelo Edessa"/>
+        <a:font script="Sora" typeface="Nirmala UI"/>
+        <a:font script="Tale" typeface="Microsoft Tai Le"/>
+        <a:font script="Talu" typeface="Microsoft New Tai Lue"/>
+        <a:font script="Tfng" typeface="Ebrima"/>
+      </a:majorFont>
+      <a:minorFont>
+        <a:latin typeface="Calibri" panose="020F0502020204030204"/>
+        <a:ea typeface=""/>
+        <a:cs typeface=""/>
+        <a:font script="Jpan" typeface="游明朝"/>
+        <a:font script="Hang" typeface="맑은 고딕"/>
+        <a:font script="Hans" typeface="等线"/>
+        <a:font script="Hant" typeface="新細明體"/>
+        <a:font script="Arab" typeface="Arial"/>
+        <a:font script="Hebr" typeface="Arial"/>
+        <a:font script="Thai" typeface="Cordia New"/>
+        <a:font script="Ethi" typeface="Nyala"/>
+        <a:font script="Beng" typeface="Vrinda"/>
+        <a:font script="Gujr" typeface="Shruti"/>
+        <a:font script="Khmr" typeface="DaunPenh"/>
+        <a:font script="Knda" typeface="Tunga"/>
+        <a:font script="Guru" typeface="Raavi"/>
+        <a:font script="Cans" typeface="Euphemia"/>
+        <a:font script="Cher" typeface="Plantagenet Cherokee"/>
+        <a:font script="Yiii" typeface="Microsoft Yi Baiti"/>
+        <a:font script="Tibt" typeface="Microsoft Himalaya"/>
+        <a:font script="Thaa" typeface="MV Boli"/>
+        <a:font script="Deva" typeface="Mangal"/>
+        <a:font script="Telu" typeface="Gautami"/>
+        <a:font script="Taml" typeface="Latha"/>
+        <a:font script="Syrc" typeface="Estrangelo Edessa"/>
+        <a:font script="Orya" typeface="Kalinga"/>
+        <a:font script="Mlym" typeface="Kartika"/>
+        <a:font script="Laoo" typeface="DokChampa"/>
+        <a:font script="Sinh" typeface="Iskoola Pota"/>
+        <a:font script="Mong" typeface="Mongolian Baiti"/>
+        <a:font script="Viet" typeface="Arial"/>
+        <a:font script="Uigh" typeface="Microsoft Uighur"/>
+        <a:font script="Geor" typeface="Sylfaen"/>
+        <a:font script="Armn" typeface="Arial"/>
+        <a:font script="Bugi" typeface="Leelawadee UI"/>
+        <a:font script="Bopo" typeface="Microsoft JhengHei"/>
+        <a:font script="Java" typeface="Javanese Text"/>
+        <a:font script="Lisu" typeface="Segoe UI"/>
+        <a:font script="Mymr" typeface="Myanmar Text"/>
+        <a:font script="Nkoo" typeface="Ebrima"/>
+        <a:font script="Olck" typeface="Nirmala UI"/>
+        <a:font script="Osma" typeface="Ebrima"/>
+        <a:font script="Phag" typeface="Phagspa"/>
+        <a:font script="Syrn" typeface="Estrangelo Edessa"/>
+        <a:font script="Syrj" typeface="Estrangelo Edessa"/>
+        <a:font script="Syre" typeface="Estrangelo Edessa"/>
+        <a:font script="Sora" typeface="Nirmala UI"/>
+        <a:font script="Tale" typeface="Microsoft Tai Le"/>
+        <a:font script="Talu" typeface="Microsoft New Tai Lue"/>
+        <a:font script="Tfng" typeface="Ebrima"/>
+      </a:minorFont>
+    </a:fontScheme>
+    <a:fmtScheme name="Office">
+      <a:fillStyleLst>
+        <a:solidFill>
+          <a:schemeClr val="phClr"/>
+        </a:solidFill>
+        <a:gradFill rotWithShape="true">
+          <a:gsLst>
+            <a:gs pos="0">
+              <a:schemeClr val="phClr">
+                <a:lumMod val="110000"/>
+                <a:satMod val="105000"/>
+                <a:tint val="67000"/>
+              </a:schemeClr>
+            </a:gs>
+            <a:gs pos="50000">
+              <a:schemeClr val="phClr">
+                <a:lumMod val="105000"/>
+                <a:satMod val="103000"/>
+                <a:tint val="73000"/>
+              </a:schemeClr>
+            </a:gs>
+            <a:gs pos="100000">
+              <a:schemeClr val="phClr">
+                <a:lumMod val="105000"/>
+                <a:satMod val="109000"/>
+                <a:tint val="81000"/>
+              </a:schemeClr>
+            </a:gs>
+          </a:gsLst>
+          <a:lin ang="5400000" scaled="false"/>
+        </a:gradFill>
+        <a:gradFill rotWithShape="true">
+          <a:gsLst>
+            <a:gs pos="0">
+              <a:schemeClr val="phClr">
+                <a:satMod val="103000"/>
+                <a:lumMod val="102000"/>
+                <a:tint val="94000"/>
+              </a:schemeClr>
+            </a:gs>
+            <a:gs pos="50000">
+              <a:schemeClr val="phClr">
+                <a:satMod val="110000"/>
+                <a:lumMod val="100000"/>
+                <a:shade val="100000"/>
+              </a:schemeClr>
+            </a:gs>
+            <a:gs pos="100000">
+              <a:schemeClr val="phClr">
+                <a:lumMod val="99000"/>
+                <a:satMod val="120000"/>
+                <a:shade val="78000"/>
+              </a:schemeClr>
+            </a:gs>
+          </a:gsLst>
+          <a:lin ang="5400000" scaled="false"/>
+        </a:gradFill>
+      </a:fillStyleLst>
+      <a:lnStyleLst>
+        <a:ln w="6350" cap="flat" cmpd="sng" algn="ctr">
+          <a:solidFill>
+            <a:schemeClr val="phClr"/>
+          </a:solidFill>
+          <a:prstDash val="solid"/>
+          <a:miter lim="800000"/>
+        </a:ln>
+        <a:ln w="12700" cap="flat" cmpd="sng" algn="ctr">
+          <a:solidFill>
+            <a:schemeClr val="phClr"/>
+          </a:solidFill>
+          <a:prstDash val="solid"/>
+          <a:miter lim="800000"/>
+        </a:ln>
+        <a:ln w="19050" cap="flat" cmpd="sng" algn="ctr">
+          <a:solidFill>
+            <a:schemeClr val="phClr"/>
+          </a:solidFill>
+          <a:prstDash val="solid"/>
+          <a:miter lim="800000"/>
+        </a:ln>
+      </a:lnStyleLst>
+      <a:effectStyleLst>
+        <a:effectStyle>
+          <a:effectLst/>
+        </a:effectStyle>
+        <a:effectStyle>
+          <a:effectLst/>
+        </a:effectStyle>
+        <a:effectStyle>
+          <a:effectLst>
+            <a:outerShdw blurRad="57150" dist="19050" dir="5400000" algn="ctr" rotWithShape="false">
+              <a:srgbClr val="000000">
+                <a:alpha val="63000"/>
+              </a:srgbClr>
+            </a:outerShdw>
+          </a:effectLst>
+        </a:effectStyle>
+      </a:effectStyleLst>
+      <a:bgFillStyleLst>
+        <a:solidFill>
+          <a:schemeClr val="phClr"/>
+        </a:solidFill>
+        <a:solidFill>
+          <a:schemeClr val="phClr">
+            <a:tint val="95000"/>
+            <a:satMod val="170000"/>
+          </a:schemeClr>
+        </a:solidFill>
+        <a:gradFill rotWithShape="true">
+          <a:gsLst>
+            <a:gs pos="0">
+              <a:schemeClr val="phClr">
+                <a:tint val="93000"/>
+                <a:satMod val="150000"/>
+                <a:shade val="98000"/>
+                <a:lumMod val="102000"/>
+              </a:schemeClr>
+            </a:gs>
+            <a:gs pos="50000">
+              <a:schemeClr val="phClr">
+                <a:tint val="98000"/>
+                <a:satMod val="130000"/>
+                <a:shade val="90000"/>
+                <a:lumMod val="103000"/>
+              </a:schemeClr>
+            </a:gs>
+            <a:gs pos="100000">
+              <a:schemeClr val="phClr">
+                <a:shade val="63000"/>
+                <a:satMod val="120000"/>
+              </a:schemeClr>
+            </a:gs>
+          </a:gsLst>
+          <a:lin ang="5400000" scaled="false"/>
+        </a:gradFill>
+      </a:bgFillStyleLst>
+    </a:fmtScheme>
+  </a:themeElements>
+  <a:objectDefaults/>
+  <a:extraClrSchemeLst/>
+</a:theme>
 </file>
</xml_diff>

<commit_message>
Valokaari: selkeä aloitus, viisi vaihetta ja yhtenäiset viikko-ohjeet
Aloitus kertoo ensin, mitä rakennetaan, kenelle ja miten edetään: tavoitekuva,
viiden numeroidun vaiheen kuvaus ja vaihekuva, ohje viikkosivun käyttöön sekä
avattavat osiot sovelluksen osista (uusi rakennekuva), dokumenttien tehtävistä,
vaatimus–ehdotus–päätös-erottelusta ja arvioinnista. Jokaisella 18 työviikolla
on oma yhteys kokonaisprojektiin ja konkreettinen tavoite, ja 60 tehtävää ovat
työvaiheita osatehtävineen (276), valmis kun -ehtoineen ja työnäytteen
paikkoineen; rinnakkaiset askellistat on siirretty työvaiheisiin. Tunnukset ja
niiden järjestys säilyivät. Uudet havainnekuvat leikkauspisteistä ja haarojen
konfliktista. Työtapa-sivu erottaa työvaiheen, GitHub-issuen ja kuusi askelta.
Word- ja PDF-työpaketti ja odotukset.json rakennettu uudelleen.

Co-Authored-By: Claude Opus 5.5 <noreply@anthropic.com>
</commit_message>
<xml_diff>
--- a/valokaari/downloads/nayton-dokumentointipohjat.docx
+++ b/valokaari/downloads/nayton-dokumentointipohjat.docx
@@ -4,7 +4,7 @@
   <w:body>
     <w:p>
       <w:pPr>
-        <w:spacing w:after="120" w:before="200"/>
+        <w:spacing w:before="200" w:after="120"/>
       </w:pPr>
       <w:r>
         <w:rPr>
@@ -33,7 +33,7 @@
     <w:p>
       <w:pPr>
         <w:pStyle w:val="Heading1"/>
-        <w:spacing w:after="160" w:before="320"/>
+        <w:spacing w:before="320" w:after="160"/>
       </w:pPr>
       <w:r>
         <w:rPr>
@@ -199,7 +199,6 @@
                 <w:sz w:val="19"/>
                 <w:szCs w:val="19"/>
               </w:rPr>
-              <w:t xml:space="preserve"/>
             </w:r>
           </w:p>
         </w:tc>
@@ -222,7 +221,6 @@
                 <w:sz w:val="19"/>
                 <w:szCs w:val="19"/>
               </w:rPr>
-              <w:t xml:space="preserve"/>
             </w:r>
           </w:p>
         </w:tc>
@@ -270,7 +268,6 @@
                 <w:sz w:val="19"/>
                 <w:szCs w:val="19"/>
               </w:rPr>
-              <w:t xml:space="preserve"/>
             </w:r>
           </w:p>
         </w:tc>
@@ -293,7 +290,6 @@
                 <w:sz w:val="19"/>
                 <w:szCs w:val="19"/>
               </w:rPr>
-              <w:t xml:space="preserve"/>
             </w:r>
           </w:p>
         </w:tc>
@@ -341,7 +337,6 @@
                 <w:sz w:val="19"/>
                 <w:szCs w:val="19"/>
               </w:rPr>
-              <w:t xml:space="preserve"/>
             </w:r>
           </w:p>
         </w:tc>
@@ -364,7 +359,6 @@
                 <w:sz w:val="19"/>
                 <w:szCs w:val="19"/>
               </w:rPr>
-              <w:t xml:space="preserve"/>
             </w:r>
           </w:p>
         </w:tc>
@@ -412,7 +406,6 @@
                 <w:sz w:val="19"/>
                 <w:szCs w:val="19"/>
               </w:rPr>
-              <w:t xml:space="preserve"/>
             </w:r>
           </w:p>
         </w:tc>
@@ -435,7 +428,6 @@
                 <w:sz w:val="19"/>
                 <w:szCs w:val="19"/>
               </w:rPr>
-              <w:t xml:space="preserve"/>
             </w:r>
           </w:p>
         </w:tc>
@@ -483,7 +475,6 @@
                 <w:sz w:val="19"/>
                 <w:szCs w:val="19"/>
               </w:rPr>
-              <w:t xml:space="preserve"/>
             </w:r>
           </w:p>
         </w:tc>
@@ -506,7 +497,6 @@
                 <w:sz w:val="19"/>
                 <w:szCs w:val="19"/>
               </w:rPr>
-              <w:t xml:space="preserve"/>
             </w:r>
           </w:p>
         </w:tc>
@@ -554,7 +544,6 @@
                 <w:sz w:val="19"/>
                 <w:szCs w:val="19"/>
               </w:rPr>
-              <w:t xml:space="preserve"/>
             </w:r>
           </w:p>
         </w:tc>
@@ -577,7 +566,6 @@
                 <w:sz w:val="19"/>
                 <w:szCs w:val="19"/>
               </w:rPr>
-              <w:t xml:space="preserve"/>
             </w:r>
           </w:p>
         </w:tc>
@@ -591,7 +579,7 @@
     <w:p>
       <w:pPr>
         <w:pStyle w:val="Heading1"/>
-        <w:spacing w:after="160" w:before="320"/>
+        <w:spacing w:before="320" w:after="160"/>
       </w:pPr>
       <w:r>
         <w:rPr>
@@ -799,7 +787,7 @@
     <w:p>
       <w:pPr>
         <w:pStyle w:val="Heading1"/>
-        <w:spacing w:after="160" w:before="320"/>
+        <w:spacing w:before="320" w:after="160"/>
       </w:pPr>
       <w:r>
         <w:rPr>
@@ -872,7 +860,6 @@
                 <w:sz w:val="19"/>
                 <w:szCs w:val="19"/>
               </w:rPr>
-              <w:t xml:space="preserve"/>
             </w:r>
           </w:p>
         </w:tc>
@@ -923,7 +910,6 @@
                 <w:sz w:val="19"/>
                 <w:szCs w:val="19"/>
               </w:rPr>
-              <w:t xml:space="preserve"/>
             </w:r>
           </w:p>
         </w:tc>
@@ -974,7 +960,6 @@
                 <w:sz w:val="19"/>
                 <w:szCs w:val="19"/>
               </w:rPr>
-              <w:t xml:space="preserve"/>
             </w:r>
           </w:p>
         </w:tc>
@@ -1025,7 +1010,6 @@
                 <w:sz w:val="19"/>
                 <w:szCs w:val="19"/>
               </w:rPr>
-              <w:t xml:space="preserve"/>
             </w:r>
           </w:p>
         </w:tc>
@@ -1076,7 +1060,6 @@
                 <w:sz w:val="19"/>
                 <w:szCs w:val="19"/>
               </w:rPr>
-              <w:t xml:space="preserve"/>
             </w:r>
           </w:p>
         </w:tc>
@@ -1127,7 +1110,6 @@
                 <w:sz w:val="19"/>
                 <w:szCs w:val="19"/>
               </w:rPr>
-              <w:t xml:space="preserve"/>
             </w:r>
           </w:p>
         </w:tc>
@@ -1156,7 +1138,7 @@
     <w:p>
       <w:pPr>
         <w:pStyle w:val="Heading1"/>
-        <w:spacing w:after="160" w:before="320"/>
+        <w:spacing w:before="320" w:after="160"/>
       </w:pPr>
       <w:r>
         <w:rPr>
@@ -1391,7 +1373,6 @@
                 <w:sz w:val="19"/>
                 <w:szCs w:val="19"/>
               </w:rPr>
-              <w:t xml:space="preserve"/>
             </w:r>
           </w:p>
         </w:tc>
@@ -1414,7 +1395,6 @@
                 <w:sz w:val="19"/>
                 <w:szCs w:val="19"/>
               </w:rPr>
-              <w:t xml:space="preserve"/>
             </w:r>
           </w:p>
         </w:tc>
@@ -1437,7 +1417,6 @@
                 <w:sz w:val="19"/>
                 <w:szCs w:val="19"/>
               </w:rPr>
-              <w:t xml:space="preserve"/>
             </w:r>
           </w:p>
         </w:tc>
@@ -1460,7 +1439,6 @@
                 <w:sz w:val="19"/>
                 <w:szCs w:val="19"/>
               </w:rPr>
-              <w:t xml:space="preserve"/>
             </w:r>
           </w:p>
         </w:tc>
@@ -1483,7 +1461,6 @@
                 <w:sz w:val="19"/>
                 <w:szCs w:val="19"/>
               </w:rPr>
-              <w:t xml:space="preserve"/>
             </w:r>
           </w:p>
         </w:tc>
@@ -1531,7 +1508,6 @@
                 <w:sz w:val="19"/>
                 <w:szCs w:val="19"/>
               </w:rPr>
-              <w:t xml:space="preserve"/>
             </w:r>
           </w:p>
         </w:tc>
@@ -1554,7 +1530,6 @@
                 <w:sz w:val="19"/>
                 <w:szCs w:val="19"/>
               </w:rPr>
-              <w:t xml:space="preserve"/>
             </w:r>
           </w:p>
         </w:tc>
@@ -1577,7 +1552,6 @@
                 <w:sz w:val="19"/>
                 <w:szCs w:val="19"/>
               </w:rPr>
-              <w:t xml:space="preserve"/>
             </w:r>
           </w:p>
         </w:tc>
@@ -1600,7 +1574,6 @@
                 <w:sz w:val="19"/>
                 <w:szCs w:val="19"/>
               </w:rPr>
-              <w:t xml:space="preserve"/>
             </w:r>
           </w:p>
         </w:tc>
@@ -1623,7 +1596,6 @@
                 <w:sz w:val="19"/>
                 <w:szCs w:val="19"/>
               </w:rPr>
-              <w:t xml:space="preserve"/>
             </w:r>
           </w:p>
         </w:tc>
@@ -1671,7 +1643,6 @@
                 <w:sz w:val="19"/>
                 <w:szCs w:val="19"/>
               </w:rPr>
-              <w:t xml:space="preserve"/>
             </w:r>
           </w:p>
         </w:tc>
@@ -1694,7 +1665,6 @@
                 <w:sz w:val="19"/>
                 <w:szCs w:val="19"/>
               </w:rPr>
-              <w:t xml:space="preserve"/>
             </w:r>
           </w:p>
         </w:tc>
@@ -1717,7 +1687,6 @@
                 <w:sz w:val="19"/>
                 <w:szCs w:val="19"/>
               </w:rPr>
-              <w:t xml:space="preserve"/>
             </w:r>
           </w:p>
         </w:tc>
@@ -1740,7 +1709,6 @@
                 <w:sz w:val="19"/>
                 <w:szCs w:val="19"/>
               </w:rPr>
-              <w:t xml:space="preserve"/>
             </w:r>
           </w:p>
         </w:tc>
@@ -1763,7 +1731,6 @@
                 <w:sz w:val="19"/>
                 <w:szCs w:val="19"/>
               </w:rPr>
-              <w:t xml:space="preserve"/>
             </w:r>
           </w:p>
         </w:tc>
@@ -1811,7 +1778,6 @@
                 <w:sz w:val="19"/>
                 <w:szCs w:val="19"/>
               </w:rPr>
-              <w:t xml:space="preserve"/>
             </w:r>
           </w:p>
         </w:tc>
@@ -1834,7 +1800,6 @@
                 <w:sz w:val="19"/>
                 <w:szCs w:val="19"/>
               </w:rPr>
-              <w:t xml:space="preserve"/>
             </w:r>
           </w:p>
         </w:tc>
@@ -1857,7 +1822,6 @@
                 <w:sz w:val="19"/>
                 <w:szCs w:val="19"/>
               </w:rPr>
-              <w:t xml:space="preserve"/>
             </w:r>
           </w:p>
         </w:tc>
@@ -1880,7 +1844,6 @@
                 <w:sz w:val="19"/>
                 <w:szCs w:val="19"/>
               </w:rPr>
-              <w:t xml:space="preserve"/>
             </w:r>
           </w:p>
         </w:tc>
@@ -1903,7 +1866,6 @@
                 <w:sz w:val="19"/>
                 <w:szCs w:val="19"/>
               </w:rPr>
-              <w:t xml:space="preserve"/>
             </w:r>
           </w:p>
         </w:tc>
@@ -1951,7 +1913,6 @@
                 <w:sz w:val="19"/>
                 <w:szCs w:val="19"/>
               </w:rPr>
-              <w:t xml:space="preserve"/>
             </w:r>
           </w:p>
         </w:tc>
@@ -1974,7 +1935,6 @@
                 <w:sz w:val="19"/>
                 <w:szCs w:val="19"/>
               </w:rPr>
-              <w:t xml:space="preserve"/>
             </w:r>
           </w:p>
         </w:tc>
@@ -1997,7 +1957,6 @@
                 <w:sz w:val="19"/>
                 <w:szCs w:val="19"/>
               </w:rPr>
-              <w:t xml:space="preserve"/>
             </w:r>
           </w:p>
         </w:tc>
@@ -2020,7 +1979,6 @@
                 <w:sz w:val="19"/>
                 <w:szCs w:val="19"/>
               </w:rPr>
-              <w:t xml:space="preserve"/>
             </w:r>
           </w:p>
         </w:tc>
@@ -2043,7 +2001,6 @@
                 <w:sz w:val="19"/>
                 <w:szCs w:val="19"/>
               </w:rPr>
-              <w:t xml:space="preserve"/>
             </w:r>
           </w:p>
         </w:tc>
@@ -2091,7 +2048,6 @@
                 <w:sz w:val="19"/>
                 <w:szCs w:val="19"/>
               </w:rPr>
-              <w:t xml:space="preserve"/>
             </w:r>
           </w:p>
         </w:tc>
@@ -2114,7 +2070,6 @@
                 <w:sz w:val="19"/>
                 <w:szCs w:val="19"/>
               </w:rPr>
-              <w:t xml:space="preserve"/>
             </w:r>
           </w:p>
         </w:tc>
@@ -2137,7 +2092,6 @@
                 <w:sz w:val="19"/>
                 <w:szCs w:val="19"/>
               </w:rPr>
-              <w:t xml:space="preserve"/>
             </w:r>
           </w:p>
         </w:tc>
@@ -2160,7 +2114,6 @@
                 <w:sz w:val="19"/>
                 <w:szCs w:val="19"/>
               </w:rPr>
-              <w:t xml:space="preserve"/>
             </w:r>
           </w:p>
         </w:tc>
@@ -2183,7 +2136,6 @@
                 <w:sz w:val="19"/>
                 <w:szCs w:val="19"/>
               </w:rPr>
-              <w:t xml:space="preserve"/>
             </w:r>
           </w:p>
         </w:tc>
@@ -2231,7 +2183,6 @@
                 <w:sz w:val="19"/>
                 <w:szCs w:val="19"/>
               </w:rPr>
-              <w:t xml:space="preserve"/>
             </w:r>
           </w:p>
         </w:tc>
@@ -2254,7 +2205,6 @@
                 <w:sz w:val="19"/>
                 <w:szCs w:val="19"/>
               </w:rPr>
-              <w:t xml:space="preserve"/>
             </w:r>
           </w:p>
         </w:tc>
@@ -2277,7 +2227,6 @@
                 <w:sz w:val="19"/>
                 <w:szCs w:val="19"/>
               </w:rPr>
-              <w:t xml:space="preserve"/>
             </w:r>
           </w:p>
         </w:tc>
@@ -2300,7 +2249,6 @@
                 <w:sz w:val="19"/>
                 <w:szCs w:val="19"/>
               </w:rPr>
-              <w:t xml:space="preserve"/>
             </w:r>
           </w:p>
         </w:tc>
@@ -2323,7 +2271,6 @@
                 <w:sz w:val="19"/>
                 <w:szCs w:val="19"/>
               </w:rPr>
-              <w:t xml:space="preserve"/>
             </w:r>
           </w:p>
         </w:tc>
@@ -2371,7 +2318,6 @@
                 <w:sz w:val="19"/>
                 <w:szCs w:val="19"/>
               </w:rPr>
-              <w:t xml:space="preserve"/>
             </w:r>
           </w:p>
         </w:tc>
@@ -2394,7 +2340,6 @@
                 <w:sz w:val="19"/>
                 <w:szCs w:val="19"/>
               </w:rPr>
-              <w:t xml:space="preserve"/>
             </w:r>
           </w:p>
         </w:tc>
@@ -2417,7 +2362,6 @@
                 <w:sz w:val="19"/>
                 <w:szCs w:val="19"/>
               </w:rPr>
-              <w:t xml:space="preserve"/>
             </w:r>
           </w:p>
         </w:tc>
@@ -2440,7 +2384,6 @@
                 <w:sz w:val="19"/>
                 <w:szCs w:val="19"/>
               </w:rPr>
-              <w:t xml:space="preserve"/>
             </w:r>
           </w:p>
         </w:tc>
@@ -2463,7 +2406,6 @@
                 <w:sz w:val="19"/>
                 <w:szCs w:val="19"/>
               </w:rPr>
-              <w:t xml:space="preserve"/>
             </w:r>
           </w:p>
         </w:tc>
@@ -2511,7 +2453,6 @@
                 <w:sz w:val="19"/>
                 <w:szCs w:val="19"/>
               </w:rPr>
-              <w:t xml:space="preserve"/>
             </w:r>
           </w:p>
         </w:tc>
@@ -2534,7 +2475,6 @@
                 <w:sz w:val="19"/>
                 <w:szCs w:val="19"/>
               </w:rPr>
-              <w:t xml:space="preserve"/>
             </w:r>
           </w:p>
         </w:tc>
@@ -2557,7 +2497,6 @@
                 <w:sz w:val="19"/>
                 <w:szCs w:val="19"/>
               </w:rPr>
-              <w:t xml:space="preserve"/>
             </w:r>
           </w:p>
         </w:tc>
@@ -2580,7 +2519,6 @@
                 <w:sz w:val="19"/>
                 <w:szCs w:val="19"/>
               </w:rPr>
-              <w:t xml:space="preserve"/>
             </w:r>
           </w:p>
         </w:tc>
@@ -2603,7 +2541,6 @@
                 <w:sz w:val="19"/>
                 <w:szCs w:val="19"/>
               </w:rPr>
-              <w:t xml:space="preserve"/>
             </w:r>
           </w:p>
         </w:tc>
@@ -2651,7 +2588,6 @@
                 <w:sz w:val="19"/>
                 <w:szCs w:val="19"/>
               </w:rPr>
-              <w:t xml:space="preserve"/>
             </w:r>
           </w:p>
         </w:tc>
@@ -2674,7 +2610,6 @@
                 <w:sz w:val="19"/>
                 <w:szCs w:val="19"/>
               </w:rPr>
-              <w:t xml:space="preserve"/>
             </w:r>
           </w:p>
         </w:tc>
@@ -2697,7 +2632,6 @@
                 <w:sz w:val="19"/>
                 <w:szCs w:val="19"/>
               </w:rPr>
-              <w:t xml:space="preserve"/>
             </w:r>
           </w:p>
         </w:tc>
@@ -2720,7 +2654,6 @@
                 <w:sz w:val="19"/>
                 <w:szCs w:val="19"/>
               </w:rPr>
-              <w:t xml:space="preserve"/>
             </w:r>
           </w:p>
         </w:tc>
@@ -2743,7 +2676,6 @@
                 <w:sz w:val="19"/>
                 <w:szCs w:val="19"/>
               </w:rPr>
-              <w:t xml:space="preserve"/>
             </w:r>
           </w:p>
         </w:tc>
@@ -2791,7 +2723,6 @@
                 <w:sz w:val="19"/>
                 <w:szCs w:val="19"/>
               </w:rPr>
-              <w:t xml:space="preserve"/>
             </w:r>
           </w:p>
         </w:tc>
@@ -2814,7 +2745,6 @@
                 <w:sz w:val="19"/>
                 <w:szCs w:val="19"/>
               </w:rPr>
-              <w:t xml:space="preserve"/>
             </w:r>
           </w:p>
         </w:tc>
@@ -2837,7 +2767,6 @@
                 <w:sz w:val="19"/>
                 <w:szCs w:val="19"/>
               </w:rPr>
-              <w:t xml:space="preserve"/>
             </w:r>
           </w:p>
         </w:tc>
@@ -2860,7 +2789,6 @@
                 <w:sz w:val="19"/>
                 <w:szCs w:val="19"/>
               </w:rPr>
-              <w:t xml:space="preserve"/>
             </w:r>
           </w:p>
         </w:tc>
@@ -2883,7 +2811,6 @@
                 <w:sz w:val="19"/>
                 <w:szCs w:val="19"/>
               </w:rPr>
-              <w:t xml:space="preserve"/>
             </w:r>
           </w:p>
         </w:tc>
@@ -2931,7 +2858,6 @@
                 <w:sz w:val="19"/>
                 <w:szCs w:val="19"/>
               </w:rPr>
-              <w:t xml:space="preserve"/>
             </w:r>
           </w:p>
         </w:tc>
@@ -2954,7 +2880,6 @@
                 <w:sz w:val="19"/>
                 <w:szCs w:val="19"/>
               </w:rPr>
-              <w:t xml:space="preserve"/>
             </w:r>
           </w:p>
         </w:tc>
@@ -2977,7 +2902,6 @@
                 <w:sz w:val="19"/>
                 <w:szCs w:val="19"/>
               </w:rPr>
-              <w:t xml:space="preserve"/>
             </w:r>
           </w:p>
         </w:tc>
@@ -3000,7 +2924,6 @@
                 <w:sz w:val="19"/>
                 <w:szCs w:val="19"/>
               </w:rPr>
-              <w:t xml:space="preserve"/>
             </w:r>
           </w:p>
         </w:tc>
@@ -3023,7 +2946,6 @@
                 <w:sz w:val="19"/>
                 <w:szCs w:val="19"/>
               </w:rPr>
-              <w:t xml:space="preserve"/>
             </w:r>
           </w:p>
         </w:tc>
@@ -3071,7 +2993,6 @@
                 <w:sz w:val="19"/>
                 <w:szCs w:val="19"/>
               </w:rPr>
-              <w:t xml:space="preserve"/>
             </w:r>
           </w:p>
         </w:tc>
@@ -3094,7 +3015,6 @@
                 <w:sz w:val="19"/>
                 <w:szCs w:val="19"/>
               </w:rPr>
-              <w:t xml:space="preserve"/>
             </w:r>
           </w:p>
         </w:tc>
@@ -3117,7 +3037,6 @@
                 <w:sz w:val="19"/>
                 <w:szCs w:val="19"/>
               </w:rPr>
-              <w:t xml:space="preserve"/>
             </w:r>
           </w:p>
         </w:tc>
@@ -3140,7 +3059,6 @@
                 <w:sz w:val="19"/>
                 <w:szCs w:val="19"/>
               </w:rPr>
-              <w:t xml:space="preserve"/>
             </w:r>
           </w:p>
         </w:tc>
@@ -3163,7 +3081,6 @@
                 <w:sz w:val="19"/>
                 <w:szCs w:val="19"/>
               </w:rPr>
-              <w:t xml:space="preserve"/>
             </w:r>
           </w:p>
         </w:tc>
@@ -3211,7 +3128,6 @@
                 <w:sz w:val="19"/>
                 <w:szCs w:val="19"/>
               </w:rPr>
-              <w:t xml:space="preserve"/>
             </w:r>
           </w:p>
         </w:tc>
@@ -3234,7 +3150,6 @@
                 <w:sz w:val="19"/>
                 <w:szCs w:val="19"/>
               </w:rPr>
-              <w:t xml:space="preserve"/>
             </w:r>
           </w:p>
         </w:tc>
@@ -3257,7 +3172,6 @@
                 <w:sz w:val="19"/>
                 <w:szCs w:val="19"/>
               </w:rPr>
-              <w:t xml:space="preserve"/>
             </w:r>
           </w:p>
         </w:tc>
@@ -3280,7 +3194,6 @@
                 <w:sz w:val="19"/>
                 <w:szCs w:val="19"/>
               </w:rPr>
-              <w:t xml:space="preserve"/>
             </w:r>
           </w:p>
         </w:tc>
@@ -3303,7 +3216,6 @@
                 <w:sz w:val="19"/>
                 <w:szCs w:val="19"/>
               </w:rPr>
-              <w:t xml:space="preserve"/>
             </w:r>
           </w:p>
         </w:tc>
@@ -3351,7 +3263,6 @@
                 <w:sz w:val="19"/>
                 <w:szCs w:val="19"/>
               </w:rPr>
-              <w:t xml:space="preserve"/>
             </w:r>
           </w:p>
         </w:tc>
@@ -3374,7 +3285,6 @@
                 <w:sz w:val="19"/>
                 <w:szCs w:val="19"/>
               </w:rPr>
-              <w:t xml:space="preserve"/>
             </w:r>
           </w:p>
         </w:tc>
@@ -3397,7 +3307,6 @@
                 <w:sz w:val="19"/>
                 <w:szCs w:val="19"/>
               </w:rPr>
-              <w:t xml:space="preserve"/>
             </w:r>
           </w:p>
         </w:tc>
@@ -3420,7 +3329,6 @@
                 <w:sz w:val="19"/>
                 <w:szCs w:val="19"/>
               </w:rPr>
-              <w:t xml:space="preserve"/>
             </w:r>
           </w:p>
         </w:tc>
@@ -3443,7 +3351,6 @@
                 <w:sz w:val="19"/>
                 <w:szCs w:val="19"/>
               </w:rPr>
-              <w:t xml:space="preserve"/>
             </w:r>
           </w:p>
         </w:tc>
@@ -3491,7 +3398,6 @@
                 <w:sz w:val="19"/>
                 <w:szCs w:val="19"/>
               </w:rPr>
-              <w:t xml:space="preserve"/>
             </w:r>
           </w:p>
         </w:tc>
@@ -3514,7 +3420,6 @@
                 <w:sz w:val="19"/>
                 <w:szCs w:val="19"/>
               </w:rPr>
-              <w:t xml:space="preserve"/>
             </w:r>
           </w:p>
         </w:tc>
@@ -3537,7 +3442,6 @@
                 <w:sz w:val="19"/>
                 <w:szCs w:val="19"/>
               </w:rPr>
-              <w:t xml:space="preserve"/>
             </w:r>
           </w:p>
         </w:tc>
@@ -3560,7 +3464,6 @@
                 <w:sz w:val="19"/>
                 <w:szCs w:val="19"/>
               </w:rPr>
-              <w:t xml:space="preserve"/>
             </w:r>
           </w:p>
         </w:tc>
@@ -3583,7 +3486,6 @@
                 <w:sz w:val="19"/>
                 <w:szCs w:val="19"/>
               </w:rPr>
-              <w:t xml:space="preserve"/>
             </w:r>
           </w:p>
         </w:tc>
@@ -3601,7 +3503,7 @@
           <w:sz w:val="21"/>
           <w:szCs w:val="21"/>
         </w:rPr>
-        <w:t xml:space="preserve">Luokat: T01–T06 normaali käyttö · T07–T12 rajat · loput virhetilanteet. Kirjoita odotus ennen testiajoa.</w:t>
+        <w:t xml:space="preserve">Merkitse jokaiselle testitapaukselle luokka: normaali käyttö, raja tai virhetilanne. Kirjoita odotus ennen testiajoa.</w:t>
       </w:r>
     </w:p>
     <w:p>
@@ -3612,7 +3514,7 @@
     <w:p>
       <w:pPr>
         <w:pStyle w:val="Heading1"/>
-        <w:spacing w:after="160" w:before="320"/>
+        <w:spacing w:before="320" w:after="160"/>
       </w:pPr>
       <w:r>
         <w:rPr>
@@ -3793,7 +3695,7 @@
     <w:p>
       <w:pPr>
         <w:pStyle w:val="Heading1"/>
-        <w:spacing w:after="160" w:before="320"/>
+        <w:spacing w:before="320" w:after="160"/>
       </w:pPr>
       <w:r>
         <w:rPr>
@@ -3936,7 +3838,6 @@
                 <w:sz w:val="19"/>
                 <w:szCs w:val="19"/>
               </w:rPr>
-              <w:t xml:space="preserve"/>
             </w:r>
           </w:p>
         </w:tc>
@@ -3959,7 +3860,6 @@
                 <w:sz w:val="19"/>
                 <w:szCs w:val="19"/>
               </w:rPr>
-              <w:t xml:space="preserve"/>
             </w:r>
           </w:p>
         </w:tc>
@@ -3982,7 +3882,6 @@
                 <w:sz w:val="19"/>
                 <w:szCs w:val="19"/>
               </w:rPr>
-              <w:t xml:space="preserve"/>
             </w:r>
           </w:p>
         </w:tc>
@@ -4007,7 +3906,6 @@
                 <w:sz w:val="19"/>
                 <w:szCs w:val="19"/>
               </w:rPr>
-              <w:t xml:space="preserve"/>
             </w:r>
           </w:p>
         </w:tc>
@@ -4030,7 +3928,6 @@
                 <w:sz w:val="19"/>
                 <w:szCs w:val="19"/>
               </w:rPr>
-              <w:t xml:space="preserve"/>
             </w:r>
           </w:p>
         </w:tc>
@@ -4053,7 +3950,6 @@
                 <w:sz w:val="19"/>
                 <w:szCs w:val="19"/>
               </w:rPr>
-              <w:t xml:space="preserve"/>
             </w:r>
           </w:p>
         </w:tc>
@@ -4078,7 +3974,6 @@
                 <w:sz w:val="19"/>
                 <w:szCs w:val="19"/>
               </w:rPr>
-              <w:t xml:space="preserve"/>
             </w:r>
           </w:p>
         </w:tc>
@@ -4101,7 +3996,6 @@
                 <w:sz w:val="19"/>
                 <w:szCs w:val="19"/>
               </w:rPr>
-              <w:t xml:space="preserve"/>
             </w:r>
           </w:p>
         </w:tc>
@@ -4124,7 +4018,6 @@
                 <w:sz w:val="19"/>
                 <w:szCs w:val="19"/>
               </w:rPr>
-              <w:t xml:space="preserve"/>
             </w:r>
           </w:p>
         </w:tc>
@@ -4149,7 +4042,6 @@
                 <w:sz w:val="19"/>
                 <w:szCs w:val="19"/>
               </w:rPr>
-              <w:t xml:space="preserve"/>
             </w:r>
           </w:p>
         </w:tc>
@@ -4172,7 +4064,6 @@
                 <w:sz w:val="19"/>
                 <w:szCs w:val="19"/>
               </w:rPr>
-              <w:t xml:space="preserve"/>
             </w:r>
           </w:p>
         </w:tc>
@@ -4195,7 +4086,6 @@
                 <w:sz w:val="19"/>
                 <w:szCs w:val="19"/>
               </w:rPr>
-              <w:t xml:space="preserve"/>
             </w:r>
           </w:p>
         </w:tc>
@@ -4220,7 +4110,6 @@
                 <w:sz w:val="19"/>
                 <w:szCs w:val="19"/>
               </w:rPr>
-              <w:t xml:space="preserve"/>
             </w:r>
           </w:p>
         </w:tc>
@@ -4243,7 +4132,6 @@
                 <w:sz w:val="19"/>
                 <w:szCs w:val="19"/>
               </w:rPr>
-              <w:t xml:space="preserve"/>
             </w:r>
           </w:p>
         </w:tc>
@@ -4266,7 +4154,6 @@
                 <w:sz w:val="19"/>
                 <w:szCs w:val="19"/>
               </w:rPr>
-              <w:t xml:space="preserve"/>
             </w:r>
           </w:p>
         </w:tc>
@@ -4291,7 +4178,6 @@
                 <w:sz w:val="19"/>
                 <w:szCs w:val="19"/>
               </w:rPr>
-              <w:t xml:space="preserve"/>
             </w:r>
           </w:p>
         </w:tc>
@@ -4314,7 +4200,6 @@
                 <w:sz w:val="19"/>
                 <w:szCs w:val="19"/>
               </w:rPr>
-              <w:t xml:space="preserve"/>
             </w:r>
           </w:p>
         </w:tc>
@@ -4337,7 +4222,6 @@
                 <w:sz w:val="19"/>
                 <w:szCs w:val="19"/>
               </w:rPr>
-              <w:t xml:space="preserve"/>
             </w:r>
           </w:p>
         </w:tc>
@@ -4362,7 +4246,6 @@
                 <w:sz w:val="19"/>
                 <w:szCs w:val="19"/>
               </w:rPr>
-              <w:t xml:space="preserve"/>
             </w:r>
           </w:p>
         </w:tc>
@@ -4385,7 +4268,6 @@
                 <w:sz w:val="19"/>
                 <w:szCs w:val="19"/>
               </w:rPr>
-              <w:t xml:space="preserve"/>
             </w:r>
           </w:p>
         </w:tc>
@@ -4408,7 +4290,6 @@
                 <w:sz w:val="19"/>
                 <w:szCs w:val="19"/>
               </w:rPr>
-              <w:t xml:space="preserve"/>
             </w:r>
           </w:p>
         </w:tc>
@@ -4433,7 +4314,6 @@
                 <w:sz w:val="19"/>
                 <w:szCs w:val="19"/>
               </w:rPr>
-              <w:t xml:space="preserve"/>
             </w:r>
           </w:p>
         </w:tc>
@@ -4456,7 +4336,6 @@
                 <w:sz w:val="19"/>
                 <w:szCs w:val="19"/>
               </w:rPr>
-              <w:t xml:space="preserve"/>
             </w:r>
           </w:p>
         </w:tc>
@@ -4479,7 +4358,6 @@
                 <w:sz w:val="19"/>
                 <w:szCs w:val="19"/>
               </w:rPr>
-              <w:t xml:space="preserve"/>
             </w:r>
           </w:p>
         </w:tc>
@@ -4508,7 +4386,7 @@
     <w:p>
       <w:pPr>
         <w:pStyle w:val="Heading1"/>
-        <w:spacing w:after="160" w:before="320"/>
+        <w:spacing w:before="320" w:after="160"/>
       </w:pPr>
       <w:r>
         <w:rPr>
@@ -4679,7 +4557,6 @@
                 <w:sz w:val="19"/>
                 <w:szCs w:val="19"/>
               </w:rPr>
-              <w:t xml:space="preserve"/>
             </w:r>
           </w:p>
         </w:tc>
@@ -4702,7 +4579,6 @@
                 <w:sz w:val="19"/>
                 <w:szCs w:val="19"/>
               </w:rPr>
-              <w:t xml:space="preserve"/>
             </w:r>
           </w:p>
         </w:tc>
@@ -4725,7 +4601,6 @@
                 <w:sz w:val="19"/>
                 <w:szCs w:val="19"/>
               </w:rPr>
-              <w:t xml:space="preserve"/>
             </w:r>
           </w:p>
         </w:tc>
@@ -4748,7 +4623,6 @@
                 <w:sz w:val="19"/>
                 <w:szCs w:val="19"/>
               </w:rPr>
-              <w:t xml:space="preserve"/>
             </w:r>
           </w:p>
         </w:tc>
@@ -4773,7 +4647,6 @@
                 <w:sz w:val="19"/>
                 <w:szCs w:val="19"/>
               </w:rPr>
-              <w:t xml:space="preserve"/>
             </w:r>
           </w:p>
         </w:tc>
@@ -4796,7 +4669,6 @@
                 <w:sz w:val="19"/>
                 <w:szCs w:val="19"/>
               </w:rPr>
-              <w:t xml:space="preserve"/>
             </w:r>
           </w:p>
         </w:tc>
@@ -4819,7 +4691,6 @@
                 <w:sz w:val="19"/>
                 <w:szCs w:val="19"/>
               </w:rPr>
-              <w:t xml:space="preserve"/>
             </w:r>
           </w:p>
         </w:tc>
@@ -4842,7 +4713,6 @@
                 <w:sz w:val="19"/>
                 <w:szCs w:val="19"/>
               </w:rPr>
-              <w:t xml:space="preserve"/>
             </w:r>
           </w:p>
         </w:tc>
@@ -4867,7 +4737,6 @@
                 <w:sz w:val="19"/>
                 <w:szCs w:val="19"/>
               </w:rPr>
-              <w:t xml:space="preserve"/>
             </w:r>
           </w:p>
         </w:tc>
@@ -4890,7 +4759,6 @@
                 <w:sz w:val="19"/>
                 <w:szCs w:val="19"/>
               </w:rPr>
-              <w:t xml:space="preserve"/>
             </w:r>
           </w:p>
         </w:tc>
@@ -4913,7 +4781,6 @@
                 <w:sz w:val="19"/>
                 <w:szCs w:val="19"/>
               </w:rPr>
-              <w:t xml:space="preserve"/>
             </w:r>
           </w:p>
         </w:tc>
@@ -4936,7 +4803,6 @@
                 <w:sz w:val="19"/>
                 <w:szCs w:val="19"/>
               </w:rPr>
-              <w:t xml:space="preserve"/>
             </w:r>
           </w:p>
         </w:tc>
@@ -4961,7 +4827,6 @@
                 <w:sz w:val="19"/>
                 <w:szCs w:val="19"/>
               </w:rPr>
-              <w:t xml:space="preserve"/>
             </w:r>
           </w:p>
         </w:tc>
@@ -4984,7 +4849,6 @@
                 <w:sz w:val="19"/>
                 <w:szCs w:val="19"/>
               </w:rPr>
-              <w:t xml:space="preserve"/>
             </w:r>
           </w:p>
         </w:tc>
@@ -5007,7 +4871,6 @@
                 <w:sz w:val="19"/>
                 <w:szCs w:val="19"/>
               </w:rPr>
-              <w:t xml:space="preserve"/>
             </w:r>
           </w:p>
         </w:tc>
@@ -5030,7 +4893,6 @@
                 <w:sz w:val="19"/>
                 <w:szCs w:val="19"/>
               </w:rPr>
-              <w:t xml:space="preserve"/>
             </w:r>
           </w:p>
         </w:tc>
@@ -5055,7 +4917,6 @@
                 <w:sz w:val="19"/>
                 <w:szCs w:val="19"/>
               </w:rPr>
-              <w:t xml:space="preserve"/>
             </w:r>
           </w:p>
         </w:tc>
@@ -5078,7 +4939,6 @@
                 <w:sz w:val="19"/>
                 <w:szCs w:val="19"/>
               </w:rPr>
-              <w:t xml:space="preserve"/>
             </w:r>
           </w:p>
         </w:tc>
@@ -5101,7 +4961,6 @@
                 <w:sz w:val="19"/>
                 <w:szCs w:val="19"/>
               </w:rPr>
-              <w:t xml:space="preserve"/>
             </w:r>
           </w:p>
         </w:tc>
@@ -5124,7 +4983,6 @@
                 <w:sz w:val="19"/>
                 <w:szCs w:val="19"/>
               </w:rPr>
-              <w:t xml:space="preserve"/>
             </w:r>
           </w:p>
         </w:tc>
@@ -5149,7 +5007,6 @@
                 <w:sz w:val="19"/>
                 <w:szCs w:val="19"/>
               </w:rPr>
-              <w:t xml:space="preserve"/>
             </w:r>
           </w:p>
         </w:tc>
@@ -5172,7 +5029,6 @@
                 <w:sz w:val="19"/>
                 <w:szCs w:val="19"/>
               </w:rPr>
-              <w:t xml:space="preserve"/>
             </w:r>
           </w:p>
         </w:tc>
@@ -5195,7 +5051,6 @@
                 <w:sz w:val="19"/>
                 <w:szCs w:val="19"/>
               </w:rPr>
-              <w:t xml:space="preserve"/>
             </w:r>
           </w:p>
         </w:tc>
@@ -5218,7 +5073,6 @@
                 <w:sz w:val="19"/>
                 <w:szCs w:val="19"/>
               </w:rPr>
-              <w:t xml:space="preserve"/>
             </w:r>
           </w:p>
         </w:tc>
@@ -5249,41 +5103,8 @@
 </w:document>
 </file>
 
-<file path=word/endnotes.xml><?xml version="1.0" encoding="utf-8"?>
-<w:endnotes xmlns:wpc="http://schemas.microsoft.com/office/word/2010/wordprocessingCanvas" xmlns:mc="http://schemas.openxmlformats.org/markup-compatibility/2006" xmlns:o="urn:schemas-microsoft-com:office:office" xmlns:r="http://schemas.openxmlformats.org/officeDocument/2006/relationships" xmlns:m="http://schemas.openxmlformats.org/officeDocument/2006/math" xmlns:v="urn:schemas-microsoft-com:vml" xmlns:wp14="http://schemas.microsoft.com/office/word/2010/wordprocessingDrawing" xmlns:wp="http://schemas.openxmlformats.org/drawingml/2006/wordprocessingDrawing" xmlns:w10="urn:schemas-microsoft-com:office:word" xmlns:w="http://schemas.openxmlformats.org/wordprocessingml/2006/main" xmlns:w14="http://schemas.microsoft.com/office/word/2010/wordml" xmlns:w15="http://schemas.microsoft.com/office/word/2012/wordml" xmlns:wpg="http://schemas.microsoft.com/office/word/2010/wordprocessingGroup" xmlns:wpi="http://schemas.microsoft.com/office/word/2010/wordprocessingInk" xmlns:wne="http://schemas.microsoft.com/office/word/2006/wordml" xmlns:wps="http://schemas.microsoft.com/office/word/2010/wordprocessingShape" mc:Ignorable="w14 w15 wp14">
-  <w:endnote w:type="separator" w:id="-1">
-    <w:p>
-      <w:pPr>
-        <w:spacing w:after="0" w:line="240" w:lineRule="auto"/>
-      </w:pPr>
-      <w:r>
-        <w:rPr>
-          <w:rStyle w:val="EndnoteReference"/>
-        </w:rPr>
-        <w:endnoteRef/>
-      </w:r>
-      <w:r>
-        <w:separator/>
-      </w:r>
-    </w:p>
-  </w:endnote>
-  <w:endnote w:type="continuationSeparator" w:id="0">
-    <w:p>
-      <w:pPr>
-        <w:spacing w:after="0" w:line="240" w:lineRule="auto"/>
-      </w:pPr>
-      <w:r>
-        <w:rPr>
-          <w:rStyle w:val="EndnoteReference"/>
-        </w:rPr>
-        <w:endnoteRef/>
-      </w:r>
-      <w:r>
-        <w:continuationSeparator/>
-      </w:r>
-    </w:p>
-  </w:endnote>
-</w:endnotes>
+<file path=word/comments.xml><?xml version="1.0" encoding="utf-8"?>
+<w:comments xmlns:cx="http://schemas.microsoft.com/office/drawing/2014/chartex" xmlns:cx1="http://schemas.microsoft.com/office/drawing/2015/9/8/chartex" xmlns:cx2="http://schemas.microsoft.com/office/drawing/2015/10/21/chartex" xmlns:cx3="http://schemas.microsoft.com/office/drawing/2016/5/9/chartex" xmlns:cx4="http://schemas.microsoft.com/office/drawing/2016/5/10/chartex" xmlns:cx5="http://schemas.microsoft.com/office/drawing/2016/5/11/chartex" xmlns:cx6="http://schemas.microsoft.com/office/drawing/2016/5/12/chartex" xmlns:cx7="http://schemas.microsoft.com/office/drawing/2016/5/13/chartex" xmlns:cx8="http://schemas.microsoft.com/office/drawing/2016/5/14/chartex" xmlns:mc="http://schemas.openxmlformats.org/markup-compatibility/2006" xmlns:aink="http://schemas.microsoft.com/office/drawing/2016/ink" xmlns:am3d="http://schemas.microsoft.com/office/drawing/2017/model3d" xmlns:o="urn:schemas-microsoft-com:office:office" xmlns:r="http://schemas.openxmlformats.org/officeDocument/2006/relationships" xmlns:m="http://schemas.openxmlformats.org/officeDocument/2006/math" xmlns:v="urn:schemas-microsoft-com:vml" xmlns:wp14="http://schemas.microsoft.com/office/word/2010/wordprocessingDrawing" xmlns:wp="http://schemas.openxmlformats.org/drawingml/2006/wordprocessingDrawing" xmlns:w10="urn:schemas-microsoft-com:office:word" xmlns:w="http://schemas.openxmlformats.org/wordprocessingml/2006/main" xmlns:w14="http://schemas.microsoft.com/office/word/2010/wordml" xmlns:w15="http://schemas.microsoft.com/office/word/2012/wordml" xmlns:w16cex="http://schemas.microsoft.com/office/word/2018/wordml/cex" xmlns:w16cid="http://schemas.microsoft.com/office/word/2016/wordml/cid" xmlns:w16="http://schemas.microsoft.com/office/word/2018/wordml" xmlns:w16sdtdh="http://schemas.microsoft.com/office/word/2020/wordml/sdtdatahash" xmlns:w16se="http://schemas.microsoft.com/office/word/2015/wordml/symex" xmlns:wpg="http://schemas.microsoft.com/office/word/2010/wordprocessingGroup" xmlns:wpi="http://schemas.microsoft.com/office/word/2010/wordprocessingInk" xmlns:wne="http://schemas.microsoft.com/office/word/2006/wordml" xmlns:wps="http://schemas.microsoft.com/office/word/2010/wordprocessingShape"/>
 </file>
 
 <file path=word/footnotes.xml><?xml version="1.0" encoding="utf-8"?>
@@ -5327,7 +5148,7 @@
 <w:numbering xmlns:wpc="http://schemas.microsoft.com/office/word/2010/wordprocessingCanvas" xmlns:mc="http://schemas.openxmlformats.org/markup-compatibility/2006" xmlns:o="urn:schemas-microsoft-com:office:office" xmlns:r="http://schemas.openxmlformats.org/officeDocument/2006/relationships" xmlns:m="http://schemas.openxmlformats.org/officeDocument/2006/math" xmlns:v="urn:schemas-microsoft-com:vml" xmlns:wp14="http://schemas.microsoft.com/office/word/2010/wordprocessingDrawing" xmlns:wp="http://schemas.openxmlformats.org/drawingml/2006/wordprocessingDrawing" xmlns:w10="urn:schemas-microsoft-com:office:word" xmlns:w="http://schemas.openxmlformats.org/wordprocessingml/2006/main" xmlns:w14="http://schemas.microsoft.com/office/word/2010/wordml" xmlns:w15="http://schemas.microsoft.com/office/word/2012/wordml" xmlns:wpg="http://schemas.microsoft.com/office/word/2010/wordprocessingGroup" xmlns:wpi="http://schemas.microsoft.com/office/word/2010/wordprocessingInk" xmlns:wne="http://schemas.microsoft.com/office/word/2006/wordml" xmlns:wps="http://schemas.microsoft.com/office/word/2010/wordprocessingShape" mc:Ignorable="w14 w15 wp14">
   <w:abstractNum w:abstractNumId="1" w15:restartNumberingAfterBreak="0">
     <w:multiLevelType w:val="hybridMultilevel"/>
-    <w:lvl w:ilvl="0" w:tentative="1">
+    <w:lvl w:ilvl="0" w15:tentative="1">
       <w:start w:val="1"/>
       <w:numFmt w:val="bullet"/>
       <w:lvlText w:val="●"/>
@@ -5336,7 +5157,7 @@
         <w:ind w:left="720" w:hanging="360"/>
       </w:pPr>
     </w:lvl>
-    <w:lvl w:ilvl="1" w:tentative="1">
+    <w:lvl w:ilvl="1" w15:tentative="1">
       <w:start w:val="1"/>
       <w:numFmt w:val="bullet"/>
       <w:lvlText w:val="○"/>
@@ -5345,7 +5166,7 @@
         <w:ind w:left="1440" w:hanging="360"/>
       </w:pPr>
     </w:lvl>
-    <w:lvl w:ilvl="2" w:tentative="1">
+    <w:lvl w:ilvl="2" w15:tentative="1">
       <w:start w:val="1"/>
       <w:numFmt w:val="bullet"/>
       <w:lvlText w:val="■"/>
@@ -5354,7 +5175,7 @@
         <w:ind w:left="2160" w:hanging="360"/>
       </w:pPr>
     </w:lvl>
-    <w:lvl w:ilvl="3" w:tentative="1">
+    <w:lvl w:ilvl="3" w15:tentative="1">
       <w:start w:val="1"/>
       <w:numFmt w:val="bullet"/>
       <w:lvlText w:val="●"/>
@@ -5363,7 +5184,7 @@
         <w:ind w:left="2880" w:hanging="360"/>
       </w:pPr>
     </w:lvl>
-    <w:lvl w:ilvl="4" w:tentative="1">
+    <w:lvl w:ilvl="4" w15:tentative="1">
       <w:start w:val="1"/>
       <w:numFmt w:val="bullet"/>
       <w:lvlText w:val="○"/>
@@ -5372,7 +5193,7 @@
         <w:ind w:left="3600" w:hanging="360"/>
       </w:pPr>
     </w:lvl>
-    <w:lvl w:ilvl="5" w:tentative="1">
+    <w:lvl w:ilvl="5" w15:tentative="1">
       <w:start w:val="1"/>
       <w:numFmt w:val="bullet"/>
       <w:lvlText w:val="■"/>
@@ -5381,7 +5202,7 @@
         <w:ind w:left="4320" w:hanging="360"/>
       </w:pPr>
     </w:lvl>
-    <w:lvl w:ilvl="6" w:tentative="1">
+    <w:lvl w:ilvl="6" w15:tentative="1">
       <w:start w:val="1"/>
       <w:numFmt w:val="bullet"/>
       <w:lvlText w:val="●"/>
@@ -5390,7 +5211,7 @@
         <w:ind w:left="5040" w:hanging="360"/>
       </w:pPr>
     </w:lvl>
-    <w:lvl w:ilvl="7" w:tentative="1">
+    <w:lvl w:ilvl="7" w15:tentative="1">
       <w:start w:val="1"/>
       <w:numFmt w:val="bullet"/>
       <w:lvlText w:val="●"/>
@@ -5399,7 +5220,7 @@
         <w:ind w:left="5760" w:hanging="360"/>
       </w:pPr>
     </w:lvl>
-    <w:lvl w:ilvl="8" w:tentative="1">
+    <w:lvl w:ilvl="8" w15:tentative="1">
       <w:start w:val="1"/>
       <w:numFmt w:val="bullet"/>
       <w:lvlText w:val="●"/>
@@ -5423,17 +5244,13 @@
   <w:docDefaults>
     <w:rPrDefault>
       <w:rPr>
-        <w:rFonts w:ascii="Calibri" w:cs="Calibri" w:eastAsia="Calibri" w:hAnsi="Calibri"/>
         <w:sz w:val="21"/>
         <w:szCs w:val="21"/>
+        <w:rFonts w:ascii="Calibri" w:cs="Calibri" w:eastAsia="Calibri" w:hAnsi="Calibri"/>
       </w:rPr>
     </w:rPrDefault>
     <w:pPrDefault/>
   </w:docDefaults>
-  <w:style w:type="paragraph" w:styleId="Normal" w:default="1">
-    <w:name w:val="Normal"/>
-    <w:qFormat/>
-  </w:style>
   <w:style w:type="paragraph" w:styleId="Title">
     <w:name w:val="Title"/>
     <w:basedOn w:val="Normal"/>
@@ -5527,8 +5344,8 @@
     <w:uiPriority w:val="99"/>
     <w:unhideWhenUsed/>
     <w:rPr>
+      <w:u w:val="single"/>
       <w:color w:val="0563C1"/>
-      <w:u w:val="single"/>
     </w:rPr>
   </w:style>
   <w:style w:type="character" w:styleId="FootnoteReference">
@@ -5568,332 +5385,5 @@
       <w:szCs w:val="20"/>
     </w:rPr>
   </w:style>
-  <w:style w:type="character" w:styleId="EndnoteReference">
-    <w:name w:val="endnote reference"/>
-    <w:basedOn w:val="DefaultParagraphFont"/>
-    <w:uiPriority w:val="99"/>
-    <w:semiHidden/>
-    <w:unhideWhenUsed/>
-    <w:rPr>
-      <w:vertAlign w:val="superscript"/>
-    </w:rPr>
-  </w:style>
-  <w:style w:type="paragraph" w:styleId="EndnoteText">
-    <w:name w:val="endnote text"/>
-    <w:basedOn w:val="Normal"/>
-    <w:link w:val="EndnoteTextChar"/>
-    <w:uiPriority w:val="99"/>
-    <w:semiHidden/>
-    <w:unhideWhenUsed/>
-    <w:pPr>
-      <w:spacing w:after="0" w:line="240" w:lineRule="auto"/>
-    </w:pPr>
-    <w:rPr>
-      <w:sz w:val="20"/>
-      <w:szCs w:val="20"/>
-    </w:rPr>
-  </w:style>
-  <w:style w:type="character" w:styleId="EndnoteTextChar">
-    <w:name w:val="Endnote Text Char"/>
-    <w:basedOn w:val="DefaultParagraphFont"/>
-    <w:link w:val="EndnoteText"/>
-    <w:uiPriority w:val="99"/>
-    <w:semiHidden/>
-    <w:unhideWhenUsed/>
-    <w:rPr>
-      <w:sz w:val="20"/>
-      <w:szCs w:val="20"/>
-    </w:rPr>
-  </w:style>
 </w:styles>
-</file>
-
-<file path=word/theme/theme1.xml><?xml version="1.0" encoding="utf-8"?>
-<a:theme xmlns:a="http://schemas.openxmlformats.org/drawingml/2006/main" name="Office Theme">
-  <a:themeElements>
-    <a:clrScheme name="Office">
-      <a:dk1>
-        <a:sysClr val="windowText" lastClr="000000"/>
-      </a:dk1>
-      <a:lt1>
-        <a:sysClr val="window" lastClr="FFFFFF"/>
-      </a:lt1>
-      <a:dk2>
-        <a:srgbClr val="44546A"/>
-      </a:dk2>
-      <a:lt2>
-        <a:srgbClr val="E7E6E6"/>
-      </a:lt2>
-      <a:accent1>
-        <a:srgbClr val="4472C4"/>
-      </a:accent1>
-      <a:accent2>
-        <a:srgbClr val="ED7D31"/>
-      </a:accent2>
-      <a:accent3>
-        <a:srgbClr val="A5A5A5"/>
-      </a:accent3>
-      <a:accent4>
-        <a:srgbClr val="FFC000"/>
-      </a:accent4>
-      <a:accent5>
-        <a:srgbClr val="5B9BD5"/>
-      </a:accent5>
-      <a:accent6>
-        <a:srgbClr val="70AD47"/>
-      </a:accent6>
-      <a:hlink>
-        <a:srgbClr val="0563C1"/>
-      </a:hlink>
-      <a:folHlink>
-        <a:srgbClr val="954F72"/>
-      </a:folHlink>
-    </a:clrScheme>
-    <a:fontScheme name="Office">
-      <a:majorFont>
-        <a:latin typeface="Calibri Light" panose="020F0302020204030204"/>
-        <a:ea typeface=""/>
-        <a:cs typeface=""/>
-        <a:font script="Jpan" typeface="游ゴシック Light"/>
-        <a:font script="Hang" typeface="맑은 고딕"/>
-        <a:font script="Hans" typeface="等线 Light"/>
-        <a:font script="Hant" typeface="新細明體"/>
-        <a:font script="Arab" typeface="Times New Roman"/>
-        <a:font script="Hebr" typeface="Times New Roman"/>
-        <a:font script="Thai" typeface="Angsana New"/>
-        <a:font script="Ethi" typeface="Nyala"/>
-        <a:font script="Beng" typeface="Vrinda"/>
-        <a:font script="Gujr" typeface="Shruti"/>
-        <a:font script="Khmr" typeface="MoolBoran"/>
-        <a:font script="Knda" typeface="Tunga"/>
-        <a:font script="Guru" typeface="Raavi"/>
-        <a:font script="Cans" typeface="Euphemia"/>
-        <a:font script="Cher" typeface="Plantagenet Cherokee"/>
-        <a:font script="Yiii" typeface="Microsoft Yi Baiti"/>
-        <a:font script="Tibt" typeface="Microsoft Himalaya"/>
-        <a:font script="Thaa" typeface="MV Boli"/>
-        <a:font script="Deva" typeface="Mangal"/>
-        <a:font script="Telu" typeface="Gautami"/>
-        <a:font script="Taml" typeface="Latha"/>
-        <a:font script="Syrc" typeface="Estrangelo Edessa"/>
-        <a:font script="Orya" typeface="Kalinga"/>
-        <a:font script="Mlym" typeface="Kartika"/>
-        <a:font script="Laoo" typeface="DokChampa"/>
-        <a:font script="Sinh" typeface="Iskoola Pota"/>
-        <a:font script="Mong" typeface="Mongolian Baiti"/>
-        <a:font script="Viet" typeface="Times New Roman"/>
-        <a:font script="Uigh" typeface="Microsoft Uighur"/>
-        <a:font script="Geor" typeface="Sylfaen"/>
-        <a:font script="Armn" typeface="Arial"/>
-        <a:font script="Bugi" typeface="Leelawadee UI"/>
-        <a:font script="Bopo" typeface="Microsoft JhengHei"/>
-        <a:font script="Java" typeface="Javanese Text"/>
-        <a:font script="Lisu" typeface="Segoe UI"/>
-        <a:font script="Mymr" typeface="Myanmar Text"/>
-        <a:font script="Nkoo" typeface="Ebrima"/>
-        <a:font script="Olck" typeface="Nirmala UI"/>
-        <a:font script="Osma" typeface="Ebrima"/>
-        <a:font script="Phag" typeface="Phagspa"/>
-        <a:font script="Syrn" typeface="Estrangelo Edessa"/>
-        <a:font script="Syrj" typeface="Estrangelo Edessa"/>
-        <a:font script="Syre" typeface="Estrangelo Edessa"/>
-        <a:font script="Sora" typeface="Nirmala UI"/>
-        <a:font script="Tale" typeface="Microsoft Tai Le"/>
-        <a:font script="Talu" typeface="Microsoft New Tai Lue"/>
-        <a:font script="Tfng" typeface="Ebrima"/>
-      </a:majorFont>
-      <a:minorFont>
-        <a:latin typeface="Calibri" panose="020F0502020204030204"/>
-        <a:ea typeface=""/>
-        <a:cs typeface=""/>
-        <a:font script="Jpan" typeface="游明朝"/>
-        <a:font script="Hang" typeface="맑은 고딕"/>
-        <a:font script="Hans" typeface="等线"/>
-        <a:font script="Hant" typeface="新細明體"/>
-        <a:font script="Arab" typeface="Arial"/>
-        <a:font script="Hebr" typeface="Arial"/>
-        <a:font script="Thai" typeface="Cordia New"/>
-        <a:font script="Ethi" typeface="Nyala"/>
-        <a:font script="Beng" typeface="Vrinda"/>
-        <a:font script="Gujr" typeface="Shruti"/>
-        <a:font script="Khmr" typeface="DaunPenh"/>
-        <a:font script="Knda" typeface="Tunga"/>
-        <a:font script="Guru" typeface="Raavi"/>
-        <a:font script="Cans" typeface="Euphemia"/>
-        <a:font script="Cher" typeface="Plantagenet Cherokee"/>
-        <a:font script="Yiii" typeface="Microsoft Yi Baiti"/>
-        <a:font script="Tibt" typeface="Microsoft Himalaya"/>
-        <a:font script="Thaa" typeface="MV Boli"/>
-        <a:font script="Deva" typeface="Mangal"/>
-        <a:font script="Telu" typeface="Gautami"/>
-        <a:font script="Taml" typeface="Latha"/>
-        <a:font script="Syrc" typeface="Estrangelo Edessa"/>
-        <a:font script="Orya" typeface="Kalinga"/>
-        <a:font script="Mlym" typeface="Kartika"/>
-        <a:font script="Laoo" typeface="DokChampa"/>
-        <a:font script="Sinh" typeface="Iskoola Pota"/>
-        <a:font script="Mong" typeface="Mongolian Baiti"/>
-        <a:font script="Viet" typeface="Arial"/>
-        <a:font script="Uigh" typeface="Microsoft Uighur"/>
-        <a:font script="Geor" typeface="Sylfaen"/>
-        <a:font script="Armn" typeface="Arial"/>
-        <a:font script="Bugi" typeface="Leelawadee UI"/>
-        <a:font script="Bopo" typeface="Microsoft JhengHei"/>
-        <a:font script="Java" typeface="Javanese Text"/>
-        <a:font script="Lisu" typeface="Segoe UI"/>
-        <a:font script="Mymr" typeface="Myanmar Text"/>
-        <a:font script="Nkoo" typeface="Ebrima"/>
-        <a:font script="Olck" typeface="Nirmala UI"/>
-        <a:font script="Osma" typeface="Ebrima"/>
-        <a:font script="Phag" typeface="Phagspa"/>
-        <a:font script="Syrn" typeface="Estrangelo Edessa"/>
-        <a:font script="Syrj" typeface="Estrangelo Edessa"/>
-        <a:font script="Syre" typeface="Estrangelo Edessa"/>
-        <a:font script="Sora" typeface="Nirmala UI"/>
-        <a:font script="Tale" typeface="Microsoft Tai Le"/>
-        <a:font script="Talu" typeface="Microsoft New Tai Lue"/>
-        <a:font script="Tfng" typeface="Ebrima"/>
-      </a:minorFont>
-    </a:fontScheme>
-    <a:fmtScheme name="Office">
-      <a:fillStyleLst>
-        <a:solidFill>
-          <a:schemeClr val="phClr"/>
-        </a:solidFill>
-        <a:gradFill rotWithShape="true">
-          <a:gsLst>
-            <a:gs pos="0">
-              <a:schemeClr val="phClr">
-                <a:lumMod val="110000"/>
-                <a:satMod val="105000"/>
-                <a:tint val="67000"/>
-              </a:schemeClr>
-            </a:gs>
-            <a:gs pos="50000">
-              <a:schemeClr val="phClr">
-                <a:lumMod val="105000"/>
-                <a:satMod val="103000"/>
-                <a:tint val="73000"/>
-              </a:schemeClr>
-            </a:gs>
-            <a:gs pos="100000">
-              <a:schemeClr val="phClr">
-                <a:lumMod val="105000"/>
-                <a:satMod val="109000"/>
-                <a:tint val="81000"/>
-              </a:schemeClr>
-            </a:gs>
-          </a:gsLst>
-          <a:lin ang="5400000" scaled="false"/>
-        </a:gradFill>
-        <a:gradFill rotWithShape="true">
-          <a:gsLst>
-            <a:gs pos="0">
-              <a:schemeClr val="phClr">
-                <a:satMod val="103000"/>
-                <a:lumMod val="102000"/>
-                <a:tint val="94000"/>
-              </a:schemeClr>
-            </a:gs>
-            <a:gs pos="50000">
-              <a:schemeClr val="phClr">
-                <a:satMod val="110000"/>
-                <a:lumMod val="100000"/>
-                <a:shade val="100000"/>
-              </a:schemeClr>
-            </a:gs>
-            <a:gs pos="100000">
-              <a:schemeClr val="phClr">
-                <a:lumMod val="99000"/>
-                <a:satMod val="120000"/>
-                <a:shade val="78000"/>
-              </a:schemeClr>
-            </a:gs>
-          </a:gsLst>
-          <a:lin ang="5400000" scaled="false"/>
-        </a:gradFill>
-      </a:fillStyleLst>
-      <a:lnStyleLst>
-        <a:ln w="6350" cap="flat" cmpd="sng" algn="ctr">
-          <a:solidFill>
-            <a:schemeClr val="phClr"/>
-          </a:solidFill>
-          <a:prstDash val="solid"/>
-          <a:miter lim="800000"/>
-        </a:ln>
-        <a:ln w="12700" cap="flat" cmpd="sng" algn="ctr">
-          <a:solidFill>
-            <a:schemeClr val="phClr"/>
-          </a:solidFill>
-          <a:prstDash val="solid"/>
-          <a:miter lim="800000"/>
-        </a:ln>
-        <a:ln w="19050" cap="flat" cmpd="sng" algn="ctr">
-          <a:solidFill>
-            <a:schemeClr val="phClr"/>
-          </a:solidFill>
-          <a:prstDash val="solid"/>
-          <a:miter lim="800000"/>
-        </a:ln>
-      </a:lnStyleLst>
-      <a:effectStyleLst>
-        <a:effectStyle>
-          <a:effectLst/>
-        </a:effectStyle>
-        <a:effectStyle>
-          <a:effectLst/>
-        </a:effectStyle>
-        <a:effectStyle>
-          <a:effectLst>
-            <a:outerShdw blurRad="57150" dist="19050" dir="5400000" algn="ctr" rotWithShape="false">
-              <a:srgbClr val="000000">
-                <a:alpha val="63000"/>
-              </a:srgbClr>
-            </a:outerShdw>
-          </a:effectLst>
-        </a:effectStyle>
-      </a:effectStyleLst>
-      <a:bgFillStyleLst>
-        <a:solidFill>
-          <a:schemeClr val="phClr"/>
-        </a:solidFill>
-        <a:solidFill>
-          <a:schemeClr val="phClr">
-            <a:tint val="95000"/>
-            <a:satMod val="170000"/>
-          </a:schemeClr>
-        </a:solidFill>
-        <a:gradFill rotWithShape="true">
-          <a:gsLst>
-            <a:gs pos="0">
-              <a:schemeClr val="phClr">
-                <a:tint val="93000"/>
-                <a:satMod val="150000"/>
-                <a:shade val="98000"/>
-                <a:lumMod val="102000"/>
-              </a:schemeClr>
-            </a:gs>
-            <a:gs pos="50000">
-              <a:schemeClr val="phClr">
-                <a:tint val="98000"/>
-                <a:satMod val="130000"/>
-                <a:shade val="90000"/>
-                <a:lumMod val="103000"/>
-              </a:schemeClr>
-            </a:gs>
-            <a:gs pos="100000">
-              <a:schemeClr val="phClr">
-                <a:shade val="63000"/>
-                <a:satMod val="120000"/>
-              </a:schemeClr>
-            </a:gs>
-          </a:gsLst>
-          <a:lin ang="5400000" scaled="false"/>
-        </a:gradFill>
-      </a:bgFillStyleLst>
-    </a:fmtScheme>
-  </a:themeElements>
-  <a:objectDefaults/>
-  <a:extraClrSchemeLst/>
-</a:theme>
 </file>
</xml_diff>

<commit_message>
Valokaari: ratkaise tehtävänannon ristiriidat
Linkitetty näyttömatriisi on project-docs/nayttomatriisi.md (perustetaan
työviikolla 17, viimeistellään 18). Rajapinnan muoto sovitaan työviikolla 2
luonnoksena ja tarkennetaan työviikolla 3 sopimukseksi api-sopimus.md.
Viikon 1 Git-järjestys: git init päivänä 2, repository julkisuustarkistuksen
jälkeen päivänä 4. Julkiseen repoon vain roolit (lainaukset roolilla merkittyinä,
nimet ohjaajalle Teamsissa); ohjaaja on asiakkaan sijainen, kunnes edustaja
nimetään. Lataukset ja odotukset rakennettu uudelleen.

Co-Authored-By: Claude Opus 5.5 <noreply@anthropic.com>
</commit_message>
<xml_diff>
--- a/valokaari/downloads/nayton-dokumentointipohjat.docx
+++ b/valokaari/downloads/nayton-dokumentointipohjat.docx
@@ -763,7 +763,7 @@
           <w:sz w:val="21"/>
           <w:szCs w:val="21"/>
         </w:rPr>
-        <w:t xml:space="preserve">Keskustelukumppani, rooli ja pvm:</w:t>
+        <w:t xml:space="preserve">Keskustelukumppanin rooli (ei nimeä) ja pvm:</w:t>
       </w:r>
     </w:p>
     <w:p>
@@ -887,7 +887,7 @@
                 <w:sz w:val="19"/>
                 <w:szCs w:val="19"/>
               </w:rPr>
-              <w:t xml:space="preserve">Osallistujat ja roolit</w:t>
+              <w:t xml:space="preserve">Osallistujien roolit (ei nimiä)</w:t>
             </w:r>
           </w:p>
         </w:tc>
@@ -937,7 +937,7 @@
                 <w:sz w:val="19"/>
                 <w:szCs w:val="19"/>
               </w:rPr>
-              <w:t xml:space="preserve">Testaajan alkuperäinen havainto (hänen sanoillaan)</w:t>
+              <w:t xml:space="preserve">Testaajan havainto hänen sanoillaan (merkitse rooli, ei nimeä)</w:t>
             </w:r>
           </w:p>
         </w:tc>
@@ -1127,7 +1127,7 @@
           <w:sz w:val="21"/>
           <w:szCs w:val="21"/>
         </w:rPr>
-        <w:t xml:space="preserve">Erota aina testaajan sanat omasta tulkinnastasi.</w:t>
+        <w:t xml:space="preserve">Erota aina testaajan sanat omasta tulkinnastasi. Julkiseen repositoryyn kirjataan henkilöistä vain rooli; nimet ohjaajalle Teamsissa tarvittaessa.</w:t>
       </w:r>
     </w:p>
     <w:p>

</xml_diff>